<commit_message>
fix(sk): regenerate docx template with real kop surat, normal formatting, and correct signature alignment on the right
</commit_message>
<xml_diff>
--- a/public/templates/template_surat_lengkap.docx
+++ b/public/templates/template_surat_lengkap.docx
@@ -4,12 +4,50 @@
   <w:body>
     <w:p>
       <w:pPr>
-        <w:jc w:val="left"/>
-      </w:pPr>
-      <w:r>
-        <w:t xml:space="preserve">{nomor_surat}</w:t>
-      </w:r>
-    </w:p>
+        <w:jc w:val="center"/>
+      </w:pPr>
+      <w:r>
+        <w:drawing>
+          <wp:inline distT="0" distB="0" distL="0" distR="0">
+            <wp:extent cx="6667500" cy="1143000"/>
+            <wp:effectExtent t="0" r="0" b="0" l="0"/>
+            <wp:docPr id="1" name="" descr="" title=""/>
+            <wp:cNvGraphicFramePr>
+              <a:graphicFrameLocks xmlns:a="http://schemas.openxmlformats.org/drawingml/2006/main" noChangeAspect="1"/>
+            </wp:cNvGraphicFramePr>
+            <a:graphic xmlns:a="http://schemas.openxmlformats.org/drawingml/2006/main">
+              <a:graphicData uri="http://schemas.openxmlformats.org/drawingml/2006/picture">
+                <pic:pic xmlns:pic="http://schemas.openxmlformats.org/drawingml/2006/picture">
+                  <pic:nvPicPr>
+                    <pic:cNvPr id="0" name="" descr=""/>
+                    <pic:cNvPicPr>
+                      <a:picLocks noChangeAspect="1" noChangeArrowheads="1"/>
+                    </pic:cNvPicPr>
+                  </pic:nvPicPr>
+                  <pic:blipFill>
+                    <a:blip r:embed="rId7" cstate="none"/>
+                    <a:srcRect/>
+                    <a:stretch>
+                      <a:fillRect/>
+                    </a:stretch>
+                  </pic:blipFill>
+                  <pic:spPr bwMode="auto">
+                    <a:xfrm>
+                      <a:off x="0" y="0"/>
+                      <a:ext cx="6667500" cy="1143000"/>
+                    </a:xfrm>
+                    <a:prstGeom prst="rect">
+                      <a:avLst/>
+                    </a:prstGeom>
+                  </pic:spPr>
+                </pic:pic>
+              </a:graphicData>
+            </a:graphic>
+          </wp:inline>
+        </w:drawing>
+      </w:r>
+    </w:p>
+    <w:p/>
     <w:p>
       <w:pPr>
         <w:jc w:val="right"/>
@@ -23,12 +61,12 @@
       <w:tblPr>
         <w:tblW w:type="pct" w:w="100%"/>
         <w:tblBorders>
-          <w:top w:val="none" w:color="auto" w:sz="0"/>
-          <w:left w:val="none" w:color="auto" w:sz="0"/>
-          <w:bottom w:val="none" w:color="auto" w:sz="0"/>
-          <w:right w:val="none" w:color="auto" w:sz="0"/>
-          <w:insideH w:val="none" w:color="auto" w:sz="0"/>
-          <w:insideV w:val="none" w:color="auto" w:sz="0"/>
+          <w:top w:val="none" w:color="FFFFFF" w:sz="0"/>
+          <w:left w:val="none" w:color="FFFFFF" w:sz="0"/>
+          <w:bottom w:val="none" w:color="FFFFFF" w:sz="0"/>
+          <w:right w:val="none" w:color="FFFFFF" w:sz="0"/>
+          <w:insideH w:val="single" w:color="auto" w:sz="4"/>
+          <w:insideV w:val="single" w:color="auto" w:sz="4"/>
         </w:tblBorders>
       </w:tblPr>
       <w:tblGrid>
@@ -39,6 +77,12 @@
         <w:tc>
           <w:tcPr>
             <w:tcW w:type="pct" w:w="15%"/>
+            <w:tcBorders>
+              <w:top w:val="none" w:color="FFFFFF" w:sz="0"/>
+              <w:left w:val="none" w:color="FFFFFF" w:sz="0"/>
+              <w:bottom w:val="none" w:color="FFFFFF" w:sz="0"/>
+              <w:right w:val="none" w:color="FFFFFF" w:sz="0"/>
+            </w:tcBorders>
           </w:tcPr>
           <w:p>
             <w:r>
@@ -49,6 +93,12 @@
         <w:tc>
           <w:tcPr>
             <w:tcW w:type="pct" w:w="85%"/>
+            <w:tcBorders>
+              <w:top w:val="none" w:color="FFFFFF" w:sz="0"/>
+              <w:left w:val="none" w:color="FFFFFF" w:sz="0"/>
+              <w:bottom w:val="none" w:color="FFFFFF" w:sz="0"/>
+              <w:right w:val="none" w:color="FFFFFF" w:sz="0"/>
+            </w:tcBorders>
           </w:tcPr>
           <w:p>
             <w:r>
@@ -59,6 +109,14 @@
       </w:tr>
       <w:tr>
         <w:tc>
+          <w:tcPr>
+            <w:tcBorders>
+              <w:top w:val="none" w:color="FFFFFF" w:sz="0"/>
+              <w:left w:val="none" w:color="FFFFFF" w:sz="0"/>
+              <w:bottom w:val="none" w:color="FFFFFF" w:sz="0"/>
+              <w:right w:val="none" w:color="FFFFFF" w:sz="0"/>
+            </w:tcBorders>
+          </w:tcPr>
           <w:p>
             <w:r>
               <w:t xml:space="preserve">Lampiran</w:t>
@@ -66,6 +124,14 @@
           </w:p>
         </w:tc>
         <w:tc>
+          <w:tcPr>
+            <w:tcBorders>
+              <w:top w:val="none" w:color="FFFFFF" w:sz="0"/>
+              <w:left w:val="none" w:color="FFFFFF" w:sz="0"/>
+              <w:bottom w:val="none" w:color="FFFFFF" w:sz="0"/>
+              <w:right w:val="none" w:color="FFFFFF" w:sz="0"/>
+            </w:tcBorders>
+          </w:tcPr>
           <w:p>
             <w:r>
               <w:t xml:space="preserve">: {lampiran}</w:t>
@@ -75,6 +141,14 @@
       </w:tr>
       <w:tr>
         <w:tc>
+          <w:tcPr>
+            <w:tcBorders>
+              <w:top w:val="none" w:color="FFFFFF" w:sz="0"/>
+              <w:left w:val="none" w:color="FFFFFF" w:sz="0"/>
+              <w:bottom w:val="none" w:color="FFFFFF" w:sz="0"/>
+              <w:right w:val="none" w:color="FFFFFF" w:sz="0"/>
+            </w:tcBorders>
+          </w:tcPr>
           <w:p>
             <w:r>
               <w:t xml:space="preserve">Perihal</w:t>
@@ -82,6 +156,14 @@
           </w:p>
         </w:tc>
         <w:tc>
+          <w:tcPr>
+            <w:tcBorders>
+              <w:top w:val="none" w:color="FFFFFF" w:sz="0"/>
+              <w:left w:val="none" w:color="FFFFFF" w:sz="0"/>
+              <w:bottom w:val="none" w:color="FFFFFF" w:sz="0"/>
+              <w:right w:val="none" w:color="FFFFFF" w:sz="0"/>
+            </w:tcBorders>
+          </w:tcPr>
           <w:p>
             <w:r>
               <w:rPr>
@@ -132,12 +214,12 @@
       <w:tblPr>
         <w:tblW w:type="pct" w:w="100%"/>
         <w:tblBorders>
-          <w:top w:val="none" w:color="auto" w:sz="0"/>
-          <w:left w:val="none" w:color="auto" w:sz="0"/>
-          <w:bottom w:val="none" w:color="auto" w:sz="0"/>
-          <w:right w:val="none" w:color="auto" w:sz="0"/>
-          <w:insideH w:val="none" w:color="auto" w:sz="0"/>
-          <w:insideV w:val="none" w:color="auto" w:sz="0"/>
+          <w:top w:val="none" w:color="FFFFFF" w:sz="0"/>
+          <w:left w:val="none" w:color="FFFFFF" w:sz="0"/>
+          <w:bottom w:val="none" w:color="FFFFFF" w:sz="0"/>
+          <w:right w:val="none" w:color="FFFFFF" w:sz="0"/>
+          <w:insideH w:val="single" w:color="auto" w:sz="4"/>
+          <w:insideV w:val="single" w:color="auto" w:sz="4"/>
         </w:tblBorders>
       </w:tblPr>
       <w:tblGrid>
@@ -148,12 +230,24 @@
         <w:tc>
           <w:tcPr>
             <w:tcW w:type="pct" w:w="60%"/>
+            <w:tcBorders>
+              <w:top w:val="none" w:color="FFFFFF" w:sz="0"/>
+              <w:left w:val="none" w:color="FFFFFF" w:sz="0"/>
+              <w:bottom w:val="none" w:color="FFFFFF" w:sz="0"/>
+              <w:right w:val="none" w:color="FFFFFF" w:sz="0"/>
+            </w:tcBorders>
           </w:tcPr>
           <w:p/>
         </w:tc>
         <w:tc>
           <w:tcPr>
             <w:tcW w:type="pct" w:w="40%"/>
+            <w:tcBorders>
+              <w:top w:val="none" w:color="FFFFFF" w:sz="0"/>
+              <w:left w:val="none" w:color="FFFFFF" w:sz="0"/>
+              <w:bottom w:val="none" w:color="FFFFFF" w:sz="0"/>
+              <w:right w:val="none" w:color="FFFFFF" w:sz="0"/>
+            </w:tcBorders>
           </w:tcPr>
           <w:p>
             <w:pPr>
@@ -193,7 +287,7 @@
     </w:tbl>
     <w:sectPr>
       <w:pgSz w:w="11906" w:h="16838" w:orient="portrait"/>
-      <w:pgMar w:top="1134" w:right="1134" w:bottom="1134" w:left="1440" w:header="708" w:footer="708" w:gutter="0"/>
+      <w:pgMar w:top="720" w:right="1134" w:bottom="1134" w:left="1440" w:header="708" w:footer="708" w:gutter="0"/>
       <w:pgNumType/>
       <w:docGrid w:linePitch="360"/>
     </w:sectPr>

</xml_diff>

<commit_message>
fix(sk): refine docx template spacing and NIK formatting logic
</commit_message>
<xml_diff>
--- a/public/templates/template_surat_lengkap.docx
+++ b/public/templates/template_surat_lengkap.docx
@@ -111,7 +111,9 @@
       </w:r>
     </w:p>
     <w:p>
-      <w:pPr/>
+      <w:pPr>
+        <w:spacing w:after="0" w:line="240" w:lineRule="auto"/>
+      </w:pPr>
     </w:p>
     <w:p>
       <w:pPr>
@@ -127,7 +129,9 @@
       </w:r>
     </w:p>
     <w:p>
-      <w:pPr/>
+      <w:pPr>
+        <w:spacing w:after="0" w:line="240" w:lineRule="auto"/>
+      </w:pPr>
     </w:p>
     <w:p>
       <w:pPr/>
@@ -174,10 +178,14 @@
       </w:r>
     </w:p>
     <w:p>
-      <w:pPr/>
-    </w:p>
-    <w:p>
-      <w:pPr/>
+      <w:pPr>
+        <w:spacing w:after="0" w:line="240" w:lineRule="auto"/>
+      </w:pPr>
+    </w:p>
+    <w:p>
+      <w:pPr>
+        <w:jc w:val="both"/>
+      </w:pPr>
       <w:r>
         <w:rPr>
           <w:rFonts w:ascii="Times New Roman" w:hAnsi="Times New Roman"/>
@@ -188,17 +196,14 @@
       </w:r>
     </w:p>
     <w:p>
-      <w:pPr/>
-    </w:p>
-    <w:p>
-      <w:pPr/>
-    </w:p>
-    <w:p>
-      <w:pPr/>
-    </w:p>
-    <w:p>
-      <w:pPr>
-        <w:jc w:val="right"/>
+      <w:pPr>
+        <w:spacing w:after="0" w:line="240" w:lineRule="auto"/>
+      </w:pPr>
+    </w:p>
+    <w:p>
+      <w:pPr>
+        <w:ind w:left="5670"/>
+        <w:jc w:val="center"/>
       </w:pPr>
       <w:r>
         <w:rPr>
@@ -210,20 +215,36 @@
       </w:r>
     </w:p>
     <w:p>
-      <w:pPr/>
-    </w:p>
-    <w:p>
-      <w:pPr/>
-    </w:p>
-    <w:p>
-      <w:pPr/>
-    </w:p>
-    <w:p>
-      <w:pPr/>
-    </w:p>
-    <w:p>
-      <w:pPr>
-        <w:jc w:val="right"/>
+      <w:pPr>
+        <w:spacing w:after="0" w:line="240" w:lineRule="auto"/>
+      </w:pPr>
+    </w:p>
+    <w:p>
+      <w:pPr>
+        <w:spacing w:after="0" w:line="240" w:lineRule="auto"/>
+      </w:pPr>
+    </w:p>
+    <w:p>
+      <w:pPr>
+        <w:ind w:left="5670"/>
+        <w:jc w:val="center"/>
+      </w:pPr>
+      <w:r>
+        <w:rPr>
+          <w:rFonts w:ascii="Times New Roman" w:hAnsi="Times New Roman"/>
+          <w:sz w:val="24"/>
+          <w:szCs w:val="24"/>
+          <w:b/>
+          <w:bCs/>
+          <w:u w:val="single"/>
+        </w:rPr>
+        <w:t xml:space="preserve">{nama_penandatangan}</w:t>
+      </w:r>
+    </w:p>
+    <w:p>
+      <w:pPr>
+        <w:ind w:left="5670"/>
+        <w:jc w:val="center"/>
       </w:pPr>
       <w:r>
         <w:rPr>
@@ -231,20 +252,7 @@
           <w:sz w:val="24"/>
           <w:szCs w:val="24"/>
         </w:rPr>
-        <w:t xml:space="preserve">{nama_penandatangan}</w:t>
-      </w:r>
-    </w:p>
-    <w:p>
-      <w:pPr>
-        <w:jc w:val="right"/>
-      </w:pPr>
-      <w:r>
-        <w:rPr>
-          <w:rFonts w:ascii="Times New Roman" w:hAnsi="Times New Roman"/>
-          <w:sz w:val="24"/>
-          <w:szCs w:val="24"/>
-        </w:rPr>
-        <w:t xml:space="preserve">{label_nik}{nik_penandatangan}</w:t>
+        <w:t xml:space="preserve">{nik_penandatangan}</w:t>
       </w:r>
     </w:p>
     <w:p>

</xml_diff>